<commit_message>
Move repo link to title page placeholder in report
Co-Authored-By: Claude Sonnet 4.6 <noreply@anthropic.com>
</commit_message>
<xml_diff>
--- a/assigment_docs/rl_project_report.docx
+++ b/assigment_docs/rl_project_report.docx
@@ -238,12 +238,16 @@
     <w:p>
       <w:pPr>
         <w:spacing w:after="80" w:line="360" w:lineRule="auto"/>
+        <w:jc w:val="center"/>
         <w:rPr>
           <w:sz w:val="18"/>
           <w:szCs w:val="16"/>
           <w:lang w:bidi="he-IL"/>
         </w:rPr>
       </w:pPr>
+      <w:r>
+        <w:t>https://github.com/NisoDeri/racing-RL</w:t>
+      </w:r>
     </w:p>
     <w:p>
       <w:pPr>
@@ -353,7 +357,7 @@
                     <pic:cNvPicPr/>
                   </pic:nvPicPr>
                   <pic:blipFill>
-                    <a:blip r:embed="rId6"/>
+                    <a:blip r:embed="rId7"/>
                     <a:stretch>
                       <a:fillRect/>
                     </a:stretch>
@@ -594,7 +598,7 @@
         <w:spacing w:after="160" w:line="360" w:lineRule="auto"/>
       </w:pPr>
       <w:r>
-        <w:t>The main result from the completed phases is that a PPO agent trained on randomly generated tracks achieves 100% lap completion on five held-out tracks it never saw during training, across three independent seeds. When extended to multi-car racing with self-play opponents, the agent achieves 98% lap success while also learning to overtake. All code, training scripts, and experiment artifacts are available at https://github.com/NisoDeri/racing-RL.</w:t>
+        <w:t>The main result from the completed phases is that a PPO agent trained on randomly generated tracks achieves 100% lap completion on five held-out tracks it never saw during training, across three independent seeds. When extended to multi-car racing with self-play opponents, the agent achieves 98% lap success while also learning to overtake.</w:t>
       </w:r>
     </w:p>
     <w:p>
@@ -833,7 +837,7 @@
                     <pic:cNvPicPr/>
                   </pic:nvPicPr>
                   <pic:blipFill>
-                    <a:blip r:embed="rId7"/>
+                    <a:blip r:embed="rId8"/>
                     <a:stretch>
                       <a:fillRect/>
                     </a:stretch>
@@ -2441,7 +2445,7 @@
                     <pic:cNvPicPr/>
                   </pic:nvPicPr>
                   <pic:blipFill>
-                    <a:blip r:embed="rId8"/>
+                    <a:blip r:embed="rId9"/>
                     <a:stretch>
                       <a:fillRect/>
                     </a:stretch>
@@ -2970,7 +2974,7 @@
                     <pic:cNvPicPr/>
                   </pic:nvPicPr>
                   <pic:blipFill>
-                    <a:blip r:embed="rId9"/>
+                    <a:blip r:embed="rId10"/>
                     <a:stretch>
                       <a:fillRect/>
                     </a:stretch>
@@ -3839,7 +3843,7 @@
                     <pic:cNvPicPr/>
                   </pic:nvPicPr>
                   <pic:blipFill>
-                    <a:blip r:embed="rId10"/>
+                    <a:blip r:embed="rId11"/>
                     <a:stretch>
                       <a:fillRect/>
                     </a:stretch>
@@ -3896,7 +3900,7 @@
                     <pic:cNvPicPr/>
                   </pic:nvPicPr>
                   <pic:blipFill>
-                    <a:blip r:embed="rId11"/>
+                    <a:blip r:embed="rId12"/>
                     <a:stretch>
                       <a:fillRect/>
                     </a:stretch>
@@ -16152,6 +16156,41 @@
     <w:uiPriority w:val="1"/>
     <w:rsid w:val="0049127D"/>
   </w:style>
+  <w:style w:type="character" w:styleId="Hyperlink">
+    <w:name w:val="Hyperlink"/>
+    <w:basedOn w:val="DefaultParagraphFont"/>
+    <w:uiPriority w:val="99"/>
+    <w:unhideWhenUsed/>
+    <w:rsid w:val="000E4767"/>
+    <w:rPr>
+      <w:color w:val="467886" w:themeColor="hyperlink"/>
+      <w:u w:val="single"/>
+    </w:rPr>
+  </w:style>
+  <w:style w:type="character" w:styleId="UnresolvedMention">
+    <w:name w:val="Unresolved Mention"/>
+    <w:basedOn w:val="DefaultParagraphFont"/>
+    <w:uiPriority w:val="99"/>
+    <w:semiHidden/>
+    <w:unhideWhenUsed/>
+    <w:rsid w:val="000E4767"/>
+    <w:rPr>
+      <w:color w:val="605E5C"/>
+      <w:shd w:val="clear" w:color="auto" w:fill="E1DFDD"/>
+    </w:rPr>
+  </w:style>
+  <w:style w:type="character" w:styleId="FollowedHyperlink">
+    <w:name w:val="FollowedHyperlink"/>
+    <w:basedOn w:val="DefaultParagraphFont"/>
+    <w:uiPriority w:val="99"/>
+    <w:semiHidden/>
+    <w:unhideWhenUsed/>
+    <w:rsid w:val="000E4767"/>
+    <w:rPr>
+      <w:color w:val="96607D" w:themeColor="followedHyperlink"/>
+      <w:u w:val="single"/>
+    </w:rPr>
+  </w:style>
 </w:styles>
 </file>
 

</xml_diff>